<commit_message>
Documenta la cuarta ronda de seguridad + actualiza README (36 hallazgos, 424 tests, Tailwind compilado)
Pruebas_Seguridad_LMS_CENAT.docx gana un Modulo 9 con los 5 hallazgos de
seguridad de la ultima auditoria integral (inyeccion de formulas CSV en
exportaciones, XSS en el HTML del correo de bienvenida, auto-revocacion
de admin_access sin proteccion, limite de solicitudes faltante en
creacion de contenido, y TRUST_PROXY sin validar) -- tabla resumen,
distribucion por severidad e introduccion/conclusion actualizadas de 31
a 36 hallazgos y de tres a cuatro rondas de revision.

README.md: badges y contadores desactualizados (274 tests, Tailwind
"CDN", 31 hallazgos) corregidos a como quedo el proyecto despues de esta
sesion; se documentan los scripts nuevos de build de CSS y se menciona
la creacion de contenido en la fila de rate limiting.

Co-Authored-By: Claude Sonnet 5 <noreply@anthropic.com>
</commit_message>
<xml_diff>
--- a/docs/Pruebas_Seguridad_LMS_CENAT.docx
+++ b/docs/Pruebas_Seguridad_LMS_CENAT.docx
@@ -163,7 +163,19 @@
         <w:spacing w:after="150"/>
       </w:pPr>
       <w:r>
-        <w:t>En total se identificaron y corrigieron 31 hallazgos, distribuidos en 8 módulos funcionales del sistema. Los primeros 20 se identificaron durante la revisión de seguridad inicial (julio); 4 se agregaron en una segunda fase de refuerzo (agosto), junto con nuevas funcionalidades; y los 7 restantes se identificaron en una tercera revisión, de alcance integral (seguridad, integridad transaccional y rendimiento), realizada sobre la totalidad del código del proyecto junto con el cierre de las últimas funcionalidades. La mayoría de las correcciones fueron verificadas en vivo contra el sistema en ejecución, con evidencia documentada mediante capturas de pantalla y respuestas reales de la API.</w:t>
+        <w:t xml:space="preserve">En total se </w:t>
+      </w:r>
+      <w:r>
+        <w:t>identificaron y corrigieron 36 hallazgos, distribuidos en 9 módulos</w:t>
+      </w:r>
+      <w:r>
+        <w:t xml:space="preserve"> funcionales del sistema. Los primeros 20 se identificaron durante la revisión de seguridad inicial (julio); 4 se agregaron en una segunda fase de refuerzo (agosto), junto con nuevas funcionalidades; y los 7 restantes se identificaron en una tercera revisión, de alcance integral (seguridad, integridad transaccional y rendimiento), realizada sobre la totalidad del código del proyecto junto con el cierre de las últimas funcionalidades.</w:t>
+      </w:r>
+      <w:r>
+        <w:t xml:space="preserve"> Posteriormente, una cuarta revisión (septiembre 2026), realizada como parte de una auditoría integral del código base previa a la entrega final, identificó y corrigió 5 hallazgos adicionales relacionados con inyección de fórmulas CSV en exportaciones, XSS en correo saliente, control de acceso administrativo, límites de solicitudes y validación de configuración sensible del servidor.</w:t>
+      </w:r>
+      <w:r>
+        <w:t xml:space="preserve"> La mayoría de las correcciones fueron verificadas en vivo contra el sistema en ejecución, con evidencia documentada mediante capturas de pantalla y respuestas reales de la API.</w:t>
       </w:r>
     </w:p>
     <w:p>
@@ -180,7 +192,13 @@
         <w:spacing w:after="150"/>
       </w:pPr>
       <w:r>
-        <w:t>La siguiente tabla resume los 31 hallazgos identificados y corregidos, organizados por módulo y nivel de severidad.</w:t>
+        <w:t xml:space="preserve">La siguiente </w:t>
+      </w:r>
+      <w:r>
+        <w:t>tabla resume los 36 hallazgos identificados</w:t>
+      </w:r>
+      <w:r>
+        <w:t xml:space="preserve"> y corregidos, organizados por módulo y nivel de severidad.</w:t>
       </w:r>
     </w:p>
     <w:tbl>
@@ -3020,6 +3038,596 @@
           </w:p>
         </w:tc>
       </w:tr>
+      <w:tr>
+        <w:tc>
+          <w:tcPr>
+            <w:tcW w:w="500" w:type="dxa"/>
+            <w:shd w:val="clear" w:color="auto" w:fill="F2F2F2"/>
+            <w:vAlign w:val="center"/>
+          </w:tcPr>
+          <w:p>
+            <w:pPr>
+              <w:rPr>
+                <w:sz w:val="20"/>
+                <w:szCs w:val="20"/>
+              </w:rPr>
+            </w:pPr>
+            <w:r>
+              <w:rPr>
+                <w:sz w:val="20"/>
+                <w:szCs w:val="20"/>
+              </w:rPr>
+              <w:t>32</w:t>
+            </w:r>
+          </w:p>
+        </w:tc>
+        <w:tc>
+          <w:tcPr>
+            <w:tcW w:w="2200" w:type="dxa"/>
+            <w:shd w:val="clear" w:color="auto" w:fill="F2F2F2"/>
+            <w:vAlign w:val="center"/>
+          </w:tcPr>
+          <w:p>
+            <w:pPr>
+              <w:rPr>
+                <w:sz w:val="18"/>
+                <w:szCs w:val="18"/>
+              </w:rPr>
+            </w:pPr>
+            <w:r>
+              <w:rPr>
+                <w:sz w:val="18"/>
+                <w:szCs w:val="18"/>
+              </w:rPr>
+              <w:t>Exportación de Datos</w:t>
+            </w:r>
+          </w:p>
+        </w:tc>
+        <w:tc>
+          <w:tcPr>
+            <w:tcW w:w="4200" w:type="dxa"/>
+            <w:shd w:val="clear" w:color="auto" w:fill="F2F2F2"/>
+            <w:vAlign w:val="center"/>
+          </w:tcPr>
+          <w:p>
+            <w:pPr>
+              <w:rPr>
+                <w:sz w:val="18"/>
+                <w:szCs w:val="18"/>
+              </w:rPr>
+            </w:pPr>
+            <w:r>
+              <w:rPr>
+                <w:sz w:val="18"/>
+                <w:szCs w:val="18"/>
+              </w:rPr>
+              <w:t>Inyección de fórmulas CSV en las exportaciones</w:t>
+            </w:r>
+          </w:p>
+        </w:tc>
+        <w:tc>
+          <w:tcPr>
+            <w:tcW w:w="1300" w:type="dxa"/>
+            <w:shd w:val="clear" w:color="auto" w:fill="F2F2F2"/>
+            <w:vAlign w:val="center"/>
+          </w:tcPr>
+          <w:p>
+            <w:pPr>
+              <w:rPr>
+                <w:b/>
+                <w:bCs/>
+                <w:color w:val="E36C09"/>
+                <w:sz w:val="20"/>
+                <w:szCs w:val="20"/>
+              </w:rPr>
+            </w:pPr>
+            <w:r>
+              <w:rPr>
+                <w:b/>
+                <w:bCs/>
+                <w:color w:val="E36C09"/>
+                <w:sz w:val="20"/>
+                <w:szCs w:val="20"/>
+              </w:rPr>
+              <w:t>Media</w:t>
+            </w:r>
+          </w:p>
+        </w:tc>
+        <w:tc>
+          <w:tcPr>
+            <w:tcW w:w="1800" w:type="dxa"/>
+            <w:shd w:val="clear" w:color="auto" w:fill="F2F2F2"/>
+            <w:vAlign w:val="center"/>
+          </w:tcPr>
+          <w:p>
+            <w:pPr>
+              <w:rPr>
+                <w:sz w:val="18"/>
+                <w:szCs w:val="18"/>
+              </w:rPr>
+            </w:pPr>
+            <w:r>
+              <w:rPr>
+                <w:sz w:val="18"/>
+                <w:szCs w:val="18"/>
+              </w:rPr>
+              <w:t>Por código</w:t>
+            </w:r>
+          </w:p>
+        </w:tc>
+      </w:tr>
+      <w:tr>
+        <w:tc>
+          <w:tcPr>
+            <w:tcW w:w="500" w:type="dxa"/>
+            <w:shd w:val="clear" w:color="auto" w:fill="F2F2F2"/>
+            <w:vAlign w:val="center"/>
+          </w:tcPr>
+          <w:p>
+            <w:pPr>
+              <w:rPr>
+                <w:sz w:val="20"/>
+                <w:szCs w:val="20"/>
+              </w:rPr>
+            </w:pPr>
+            <w:r>
+              <w:rPr>
+                <w:sz w:val="20"/>
+                <w:szCs w:val="20"/>
+              </w:rPr>
+              <w:t>33</w:t>
+            </w:r>
+          </w:p>
+        </w:tc>
+        <w:tc>
+          <w:tcPr>
+            <w:tcW w:w="2200" w:type="dxa"/>
+            <w:shd w:val="clear" w:color="auto" w:fill="F2F2F2"/>
+            <w:vAlign w:val="center"/>
+          </w:tcPr>
+          <w:p>
+            <w:pPr>
+              <w:rPr>
+                <w:sz w:val="18"/>
+                <w:szCs w:val="18"/>
+              </w:rPr>
+            </w:pPr>
+            <w:r>
+              <w:rPr>
+                <w:sz w:val="18"/>
+                <w:szCs w:val="18"/>
+              </w:rPr>
+              <w:t>Notificaciones por Correo</w:t>
+            </w:r>
+          </w:p>
+        </w:tc>
+        <w:tc>
+          <w:tcPr>
+            <w:tcW w:w="4200" w:type="dxa"/>
+            <w:shd w:val="clear" w:color="auto" w:fill="F2F2F2"/>
+            <w:vAlign w:val="center"/>
+          </w:tcPr>
+          <w:p>
+            <w:pPr>
+              <w:rPr>
+                <w:sz w:val="18"/>
+                <w:szCs w:val="18"/>
+              </w:rPr>
+            </w:pPr>
+            <w:r>
+              <w:rPr>
+                <w:sz w:val="18"/>
+                <w:szCs w:val="18"/>
+              </w:rPr>
+              <w:t>Vulnerabilidad XSS en el HTML del correo de bienvenida</w:t>
+            </w:r>
+          </w:p>
+        </w:tc>
+        <w:tc>
+          <w:tcPr>
+            <w:tcW w:w="1300" w:type="dxa"/>
+            <w:shd w:val="clear" w:color="auto" w:fill="F2F2F2"/>
+            <w:vAlign w:val="center"/>
+          </w:tcPr>
+          <w:p>
+            <w:pPr>
+              <w:rPr>
+                <w:b/>
+                <w:bCs/>
+                <w:color w:val="E36C09"/>
+                <w:sz w:val="20"/>
+                <w:szCs w:val="20"/>
+              </w:rPr>
+            </w:pPr>
+            <w:r>
+              <w:rPr>
+                <w:b/>
+                <w:bCs/>
+                <w:color w:val="E36C09"/>
+                <w:sz w:val="20"/>
+                <w:szCs w:val="20"/>
+              </w:rPr>
+              <w:t>Media</w:t>
+            </w:r>
+          </w:p>
+        </w:tc>
+        <w:tc>
+          <w:tcPr>
+            <w:tcW w:w="1800" w:type="dxa"/>
+            <w:shd w:val="clear" w:color="auto" w:fill="F2F2F2"/>
+            <w:vAlign w:val="center"/>
+          </w:tcPr>
+          <w:p>
+            <w:pPr>
+              <w:rPr>
+                <w:sz w:val="18"/>
+                <w:szCs w:val="18"/>
+              </w:rPr>
+            </w:pPr>
+            <w:r>
+              <w:rPr>
+                <w:sz w:val="18"/>
+                <w:szCs w:val="18"/>
+              </w:rPr>
+              <w:t>Por código</w:t>
+            </w:r>
+          </w:p>
+        </w:tc>
+      </w:tr>
+      <w:tr>
+        <w:tc>
+          <w:tcPr>
+            <w:tcW w:w="500" w:type="dxa"/>
+            <w:shd w:val="clear" w:color="auto" w:fill="F2F2F2"/>
+            <w:vAlign w:val="center"/>
+          </w:tcPr>
+          <w:p>
+            <w:pPr>
+              <w:rPr>
+                <w:sz w:val="20"/>
+                <w:szCs w:val="20"/>
+              </w:rPr>
+            </w:pPr>
+            <w:r>
+              <w:rPr>
+                <w:sz w:val="20"/>
+                <w:szCs w:val="20"/>
+              </w:rPr>
+              <w:t>34</w:t>
+            </w:r>
+          </w:p>
+        </w:tc>
+        <w:tc>
+          <w:tcPr>
+            <w:tcW w:w="2200" w:type="dxa"/>
+            <w:shd w:val="clear" w:color="auto" w:fill="F2F2F2"/>
+            <w:vAlign w:val="center"/>
+          </w:tcPr>
+          <w:p>
+            <w:pPr>
+              <w:rPr>
+                <w:sz w:val="18"/>
+                <w:szCs w:val="18"/>
+              </w:rPr>
+            </w:pPr>
+            <w:r>
+              <w:rPr>
+                <w:sz w:val="18"/>
+                <w:szCs w:val="18"/>
+              </w:rPr>
+              <w:t>Gestión de Usuarios</w:t>
+            </w:r>
+          </w:p>
+        </w:tc>
+        <w:tc>
+          <w:tcPr>
+            <w:tcW w:w="4200" w:type="dxa"/>
+            <w:shd w:val="clear" w:color="auto" w:fill="F2F2F2"/>
+            <w:vAlign w:val="center"/>
+          </w:tcPr>
+          <w:p>
+            <w:pPr>
+              <w:rPr>
+                <w:sz w:val="18"/>
+                <w:szCs w:val="18"/>
+              </w:rPr>
+            </w:pPr>
+            <w:r>
+              <w:rPr>
+                <w:sz w:val="18"/>
+                <w:szCs w:val="18"/>
+              </w:rPr>
+              <w:t>Auto-revocación de acceso de administrador sin protección</w:t>
+            </w:r>
+          </w:p>
+        </w:tc>
+        <w:tc>
+          <w:tcPr>
+            <w:tcW w:w="1300" w:type="dxa"/>
+            <w:shd w:val="clear" w:color="auto" w:fill="F2F2F2"/>
+            <w:vAlign w:val="center"/>
+          </w:tcPr>
+          <w:p>
+            <w:pPr>
+              <w:rPr>
+                <w:b/>
+                <w:bCs/>
+                <w:color w:val="E36C09"/>
+                <w:sz w:val="20"/>
+                <w:szCs w:val="20"/>
+              </w:rPr>
+            </w:pPr>
+            <w:r>
+              <w:rPr>
+                <w:b/>
+                <w:bCs/>
+                <w:color w:val="E36C09"/>
+                <w:sz w:val="20"/>
+                <w:szCs w:val="20"/>
+              </w:rPr>
+              <w:t>Media</w:t>
+            </w:r>
+          </w:p>
+        </w:tc>
+        <w:tc>
+          <w:tcPr>
+            <w:tcW w:w="1800" w:type="dxa"/>
+            <w:shd w:val="clear" w:color="auto" w:fill="F2F2F2"/>
+            <w:vAlign w:val="center"/>
+          </w:tcPr>
+          <w:p>
+            <w:pPr>
+              <w:rPr>
+                <w:sz w:val="18"/>
+                <w:szCs w:val="18"/>
+              </w:rPr>
+            </w:pPr>
+            <w:r>
+              <w:rPr>
+                <w:sz w:val="18"/>
+                <w:szCs w:val="18"/>
+              </w:rPr>
+              <w:t>Por código</w:t>
+            </w:r>
+          </w:p>
+        </w:tc>
+      </w:tr>
+      <w:tr>
+        <w:tc>
+          <w:tcPr>
+            <w:tcW w:w="500" w:type="dxa"/>
+            <w:shd w:val="clear" w:color="auto" w:fill="F2F2F2"/>
+            <w:vAlign w:val="center"/>
+          </w:tcPr>
+          <w:p>
+            <w:pPr>
+              <w:rPr>
+                <w:sz w:val="20"/>
+                <w:szCs w:val="20"/>
+              </w:rPr>
+            </w:pPr>
+            <w:r>
+              <w:rPr>
+                <w:sz w:val="20"/>
+                <w:szCs w:val="20"/>
+              </w:rPr>
+              <w:t>35</w:t>
+            </w:r>
+          </w:p>
+        </w:tc>
+        <w:tc>
+          <w:tcPr>
+            <w:tcW w:w="2200" w:type="dxa"/>
+            <w:shd w:val="clear" w:color="auto" w:fill="F2F2F2"/>
+            <w:vAlign w:val="center"/>
+          </w:tcPr>
+          <w:p>
+            <w:pPr>
+              <w:rPr>
+                <w:sz w:val="18"/>
+                <w:szCs w:val="18"/>
+              </w:rPr>
+            </w:pPr>
+            <w:r>
+              <w:rPr>
+                <w:sz w:val="18"/>
+                <w:szCs w:val="18"/>
+              </w:rPr>
+              <w:t>Límite de Solicitudes</w:t>
+            </w:r>
+          </w:p>
+        </w:tc>
+        <w:tc>
+          <w:tcPr>
+            <w:tcW w:w="4200" w:type="dxa"/>
+            <w:shd w:val="clear" w:color="auto" w:fill="F2F2F2"/>
+            <w:vAlign w:val="center"/>
+          </w:tcPr>
+          <w:p>
+            <w:pPr>
+              <w:rPr>
+                <w:sz w:val="18"/>
+                <w:szCs w:val="18"/>
+              </w:rPr>
+            </w:pPr>
+            <w:r>
+              <w:rPr>
+                <w:sz w:val="18"/>
+                <w:szCs w:val="18"/>
+              </w:rPr>
+              <w:t>Sin límite de solicitudes en la creación de contenido de un curso</w:t>
+            </w:r>
+          </w:p>
+        </w:tc>
+        <w:tc>
+          <w:tcPr>
+            <w:tcW w:w="1300" w:type="dxa"/>
+            <w:shd w:val="clear" w:color="auto" w:fill="F2F2F2"/>
+            <w:vAlign w:val="center"/>
+          </w:tcPr>
+          <w:p>
+            <w:pPr>
+              <w:rPr>
+                <w:b/>
+                <w:bCs/>
+                <w:color w:val="E36C09"/>
+                <w:sz w:val="20"/>
+                <w:szCs w:val="20"/>
+              </w:rPr>
+            </w:pPr>
+            <w:r>
+              <w:rPr>
+                <w:b/>
+                <w:bCs/>
+                <w:color w:val="E36C09"/>
+                <w:sz w:val="20"/>
+                <w:szCs w:val="20"/>
+              </w:rPr>
+              <w:t>Baja</w:t>
+            </w:r>
+          </w:p>
+        </w:tc>
+        <w:tc>
+          <w:tcPr>
+            <w:tcW w:w="1800" w:type="dxa"/>
+            <w:shd w:val="clear" w:color="auto" w:fill="F2F2F2"/>
+            <w:vAlign w:val="center"/>
+          </w:tcPr>
+          <w:p>
+            <w:pPr>
+              <w:rPr>
+                <w:sz w:val="18"/>
+                <w:szCs w:val="18"/>
+              </w:rPr>
+            </w:pPr>
+            <w:r>
+              <w:rPr>
+                <w:sz w:val="18"/>
+                <w:szCs w:val="18"/>
+              </w:rPr>
+              <w:t>Por código</w:t>
+            </w:r>
+          </w:p>
+        </w:tc>
+      </w:tr>
+      <w:tr>
+        <w:tc>
+          <w:tcPr>
+            <w:tcW w:w="500" w:type="dxa"/>
+            <w:shd w:val="clear" w:color="auto" w:fill="F2F2F2"/>
+            <w:vAlign w:val="center"/>
+          </w:tcPr>
+          <w:p>
+            <w:pPr>
+              <w:rPr>
+                <w:sz w:val="20"/>
+                <w:szCs w:val="20"/>
+              </w:rPr>
+            </w:pPr>
+            <w:r>
+              <w:rPr>
+                <w:sz w:val="20"/>
+                <w:szCs w:val="20"/>
+              </w:rPr>
+              <w:t>36</w:t>
+            </w:r>
+          </w:p>
+        </w:tc>
+        <w:tc>
+          <w:tcPr>
+            <w:tcW w:w="2200" w:type="dxa"/>
+            <w:shd w:val="clear" w:color="auto" w:fill="F2F2F2"/>
+            <w:vAlign w:val="center"/>
+          </w:tcPr>
+          <w:p>
+            <w:pPr>
+              <w:rPr>
+                <w:sz w:val="18"/>
+                <w:szCs w:val="18"/>
+              </w:rPr>
+            </w:pPr>
+            <w:r>
+              <w:rPr>
+                <w:sz w:val="18"/>
+                <w:szCs w:val="18"/>
+              </w:rPr>
+              <w:t>Configuración General del Servidor</w:t>
+            </w:r>
+          </w:p>
+        </w:tc>
+        <w:tc>
+          <w:tcPr>
+            <w:tcW w:w="4200" w:type="dxa"/>
+            <w:shd w:val="clear" w:color="auto" w:fill="F2F2F2"/>
+            <w:vAlign w:val="center"/>
+          </w:tcPr>
+          <w:p>
+            <w:pPr>
+              <w:rPr>
+                <w:sz w:val="18"/>
+                <w:szCs w:val="18"/>
+              </w:rPr>
+            </w:pPr>
+            <w:r>
+              <w:rPr>
+                <w:sz w:val="18"/>
+                <w:szCs w:val="18"/>
+              </w:rPr>
+              <w:t>Configuración de TRUST_PROXY sin validar</w:t>
+            </w:r>
+          </w:p>
+        </w:tc>
+        <w:tc>
+          <w:tcPr>
+            <w:tcW w:w="1300" w:type="dxa"/>
+            <w:shd w:val="clear" w:color="auto" w:fill="F2F2F2"/>
+            <w:vAlign w:val="center"/>
+          </w:tcPr>
+          <w:p>
+            <w:pPr>
+              <w:rPr>
+                <w:b/>
+                <w:bCs/>
+                <w:color w:val="E36C09"/>
+                <w:sz w:val="20"/>
+                <w:szCs w:val="20"/>
+              </w:rPr>
+            </w:pPr>
+            <w:r>
+              <w:rPr>
+                <w:b/>
+                <w:bCs/>
+                <w:color w:val="E36C09"/>
+                <w:sz w:val="20"/>
+                <w:szCs w:val="20"/>
+              </w:rPr>
+              <w:t>Media</w:t>
+            </w:r>
+          </w:p>
+        </w:tc>
+        <w:tc>
+          <w:tcPr>
+            <w:tcW w:w="1800" w:type="dxa"/>
+            <w:shd w:val="clear" w:color="auto" w:fill="F2F2F2"/>
+            <w:vAlign w:val="center"/>
+          </w:tcPr>
+          <w:p>
+            <w:pPr>
+              <w:rPr>
+                <w:sz w:val="18"/>
+                <w:szCs w:val="18"/>
+              </w:rPr>
+            </w:pPr>
+            <w:r>
+              <w:rPr>
+                <w:sz w:val="18"/>
+                <w:szCs w:val="18"/>
+              </w:rPr>
+              <w:t>Por código</w:t>
+            </w:r>
+          </w:p>
+        </w:tc>
+      </w:tr>
     </w:tbl>
     <w:p>
       <w:pPr>
@@ -3074,7 +3682,10 @@
         <w:spacing w:after="80"/>
       </w:pPr>
       <w:r>
-        <w:t>Media: 14 hallazgos — configuración de seguridad incompleta, falta de validación de datos, o riesgos de integridad de datos ante fallos a mitad de una operación.</w:t>
+        <w:t>Media: 18 hallazgos</w:t>
+      </w:r>
+      <w:r>
+        <w:t xml:space="preserve"> — configuración de seguridad incompleta, falta de validación de datos, o riesgos de integridad de datos ante fallos a mitad de una operación.</w:t>
       </w:r>
     </w:p>
     <w:p>
@@ -3087,7 +3698,10 @@
         <w:spacing w:after="80"/>
       </w:pPr>
       <w:r>
-        <w:t>Baja: 4 hallazgos — mejoras de manejo de errores, experiencia de usuario y límites de uso.</w:t>
+        <w:t>Baja: 5 hallazgos</w:t>
+      </w:r>
+      <w:r>
+        <w:t xml:space="preserve"> — mejoras de manejo de errores, experiencia de usuario y límites de uso.</w:t>
       </w:r>
     </w:p>
     <w:p>
@@ -3101,7 +3715,6 @@
         <w:spacing w:before="400" w:after="200"/>
       </w:pPr>
       <w:r>
-        <w:lastRenderedPageBreak/>
         <w:t>3. Detalle de Hallazgos y Correcciones por Módulo</w:t>
       </w:r>
     </w:p>
@@ -3366,7 +3979,6 @@
         <w:spacing w:before="200" w:after="100"/>
       </w:pPr>
       <w:r>
-        <w:lastRenderedPageBreak/>
         <w:t>5. Almacén de sesiones no apto para producción  (Severidad: Alta)</w:t>
       </w:r>
     </w:p>
@@ -3679,7 +4291,6 @@
           <w:b/>
           <w:bCs/>
         </w:rPr>
-        <w:lastRenderedPageBreak/>
         <w:t xml:space="preserve">Evidencia de verificación: </w:t>
       </w:r>
       <w:r>
@@ -5075,11 +5686,238 @@
     </w:p>
     <w:p>
       <w:pPr>
+        <w:pStyle w:val="Ttulo2"/>
+      </w:pPr>
+      <w:r>
+        <w:t>Módulo 9 — Cuarta Revisión: Auditoría Integral de Código (Septiembre 2026)</w:t>
+      </w:r>
+    </w:p>
+    <w:p>
+      <w:pPr>
+        <w:pStyle w:val="Ttulo3"/>
+      </w:pPr>
+      <w:r>
+        <w:t>32. Inyección de fórmulas CSV en las exportaciones  (Severidad: Media)</w:t>
+      </w:r>
+    </w:p>
+    <w:p>
+      <w:r>
+        <w:rPr>
+          <w:b/>
+        </w:rPr>
+        <w:t>Archivo(s):</w:t>
+      </w:r>
+      <w:r>
+        <w:t xml:space="preserve"> src/utils/csv.js</w:t>
+      </w:r>
+    </w:p>
+    <w:p>
+      <w:r>
+        <w:rPr>
+          <w:b/>
+        </w:rPr>
+        <w:t>Problema:</w:t>
+      </w:r>
+      <w:r>
+        <w:t xml:space="preserve"> Los archivos CSV exportados (notas de curso/estudiante, resultados de importación masiva de usuarios) escribían el valor de cada celda tal cual, sin ningún tratamiento especial. Un valor que empezara con =, +, - o @ (por ejemplo, un nombre de usuario "=cmd|'/c calc'!A1") se interpreta como una fórmula al abrir el archivo en Excel o Google Sheets, permitiendo ejecutar comandos o fórmulas arbitrarias en el equipo de quien lo abre (CWE-1236, "CSV Injection").</w:t>
+      </w:r>
+    </w:p>
+    <w:p>
+      <w:r>
+        <w:rPr>
+          <w:b/>
+        </w:rPr>
+        <w:t>Corrección aplicada:</w:t>
+      </w:r>
+      <w:r>
+        <w:t xml:space="preserve"> La función escapeField() de toCsv() antepone un apóstrofe a cualquier valor que empiece con esos caracteres (o con tabulador/retorno de carro) antes del escapado de comillas/comas ya existente, forzando a Excel/Sheets a tratarlo como texto plano en vez de evaluarlo.</w:t>
+      </w:r>
+    </w:p>
+    <w:p>
+      <w:r>
+        <w:rPr>
+          <w:b/>
+        </w:rPr>
+        <w:t>Evidencia de verificación:</w:t>
+      </w:r>
+      <w:r>
+        <w:t xml:space="preserve"> Verificado mediante 3 pruebas automatizadas nuevas en tests/utils/csv.test.js, incluyendo el caso de un valor peligroso que además contiene una coma (debe quedar apostrofado Y entre comillas) y el caso de un valor que no empieza con esos caracteres (no debe alterarse).</w:t>
+      </w:r>
+    </w:p>
+    <w:p>
+      <w:pPr>
+        <w:pStyle w:val="Ttulo3"/>
+      </w:pPr>
+      <w:r>
+        <w:t>33. Vulnerabilidad XSS en el HTML del correo de bienvenida  (Severidad: Media)</w:t>
+      </w:r>
+    </w:p>
+    <w:p>
+      <w:r>
+        <w:rPr>
+          <w:b/>
+        </w:rPr>
+        <w:t>Archivo(s):</w:t>
+      </w:r>
+      <w:r>
+        <w:t xml:space="preserve"> src/config/mailer.js</w:t>
+      </w:r>
+    </w:p>
+    <w:p>
+      <w:r>
+        <w:rPr>
+          <w:b/>
+        </w:rPr>
+        <w:t>Problema:</w:t>
+      </w:r>
+      <w:r>
+        <w:t xml:space="preserve"> sendWelcomeEmail (disparado desde la importación masiva de usuarios por CSV) interpolaba directamente el nombre del usuario y el título del curso en el HTML del correo, sin escapar. Un valor con "&lt;" o "&amp;" en cualquiera de esos dos campos del CSV rompía el markup del correo o insertaba HTML/JavaScript arbitrario, que se ejecutaría en el cliente de correo de quien lo recibe, no solo del administrador que hizo la importación.</w:t>
+      </w:r>
+    </w:p>
+    <w:p>
+      <w:r>
+        <w:rPr>
+          <w:b/>
+        </w:rPr>
+        <w:t>Corrección aplicada:</w:t>
+      </w:r>
+      <w:r>
+        <w:t xml:space="preserve"> Se agregó un escapeHtml() local en mailer.js, aplicado a name y courseTitle antes de interpolarlos en la plantilla HTML del correo.</w:t>
+      </w:r>
+    </w:p>
+    <w:p>
+      <w:pPr>
+        <w:pStyle w:val="Ttulo3"/>
+      </w:pPr>
+      <w:r>
+        <w:t>34. Auto-revocación de acceso de administrador sin protección  (Severidad: Media)</w:t>
+      </w:r>
+    </w:p>
+    <w:p>
+      <w:r>
+        <w:rPr>
+          <w:b/>
+        </w:rPr>
+        <w:t>Archivo(s):</w:t>
+      </w:r>
+      <w:r>
+        <w:t xml:space="preserve"> src/controllers/user.controller.js</w:t>
+      </w:r>
+    </w:p>
+    <w:p>
+      <w:r>
+        <w:rPr>
+          <w:b/>
+        </w:rPr>
+        <w:t>Problema:</w:t>
+      </w:r>
+      <w:r>
+        <w:t xml:space="preserve"> El hallazgo #16 ya protegía el cambio de rol de un administrador sobre sí mismo, pero no cubría admin_access, el acceso adicional de administrador que puede tener un profesor con doble rol. Un profesor con admin_access podía quitárselo a sí mismo con un clic desde su propia gestión de usuarios, sin confirmación ni forma de revertirlo desde la interfaz si era el único con privilegios activos en ese momento.</w:t>
+      </w:r>
+    </w:p>
+    <w:p>
+      <w:r>
+        <w:rPr>
+          <w:b/>
+        </w:rPr>
+        <w:t>Corrección aplicada:</w:t>
+      </w:r>
+      <w:r>
+        <w:t xml:space="preserve"> setUserAdminAccess ahora responde 400 si el usuario autenticado intenta modificar su propio admin_access, mismo criterio que ya usan toggleUserActive/deleteUser sobre sí mismo.</w:t>
+      </w:r>
+    </w:p>
+    <w:p>
+      <w:pPr>
+        <w:pStyle w:val="Ttulo3"/>
+      </w:pPr>
+      <w:r>
+        <w:t>35. Sin límite de solicitudes en la creación de contenido de un curso  (Severidad: Baja)</w:t>
+      </w:r>
+    </w:p>
+    <w:p>
+      <w:r>
+        <w:rPr>
+          <w:b/>
+        </w:rPr>
+        <w:t>Archivo(s):</w:t>
+      </w:r>
+      <w:r>
+        <w:t xml:space="preserve"> src/middlewares/rateLimit.middleware.js, src/routes/content.routes.js</w:t>
+      </w:r>
+    </w:p>
+    <w:p>
+      <w:r>
+        <w:rPr>
+          <w:b/>
+        </w:rPr>
+        <w:t>Problema:</w:t>
+      </w:r>
+      <w:r>
+        <w:t xml:space="preserve"> Los límites de solicitudes existentes (hallazgos #4, #23, #29) no cubrían las 10 rutas de creación de contenido dentro de un curso (video, archivo, imagen, texto, url, tarea, cuestionario, encuesta, foro, carpeta) ni el envío de respuestas de un cuestionario/encuesta. Una sesión de profesor o administrador comprometida podía crear contenido de forma masiva sin ningún límite.</w:t>
+      </w:r>
+    </w:p>
+    <w:p>
+      <w:r>
+        <w:rPr>
+          <w:b/>
+        </w:rPr>
+        <w:t>Corrección aplicada:</w:t>
+      </w:r>
+      <w:r>
+        <w:t xml:space="preserve"> Se agregó contentCreateLimiter (40 creaciones por hora, por usuario autenticado) a las 10 rutas de creación de contenido, y submitTaskLimiter al envío de respuestas de cuestionario/encuesta.</w:t>
+      </w:r>
+    </w:p>
+    <w:p>
+      <w:pPr>
+        <w:pStyle w:val="Ttulo3"/>
+      </w:pPr>
+      <w:r>
+        <w:t>36. Configuración de TRUST_PROXY sin validar  (Severidad: Media)</w:t>
+      </w:r>
+    </w:p>
+    <w:p>
+      <w:r>
+        <w:rPr>
+          <w:b/>
+        </w:rPr>
+        <w:t>Archivo(s):</w:t>
+      </w:r>
+      <w:r>
+        <w:t xml:space="preserve"> src/app.js</w:t>
+      </w:r>
+    </w:p>
+    <w:p>
+      <w:r>
+        <w:rPr>
+          <w:b/>
+        </w:rPr>
+        <w:t>Problema:</w:t>
+      </w:r>
+      <w:r>
+        <w:t xml:space="preserve"> La variable de entorno TRUST_PROXY (usada por Express para decidir si confiar en las cabeceras X-Forwarded-For/-Proto de un proxy real) se pasaba directo a app.set('trust proxy', ...) sin validar su formato. Un valor mal tipeado en el .env de un despliegue real cambia en silencio una configuración sensible a suplantación de IP: confiar en esas cabeceras sin que exista un proxy real de por medio permite que cualquier cliente falsifique su propia IP y evada el límite de solicitudes por IP (hallazgo #4); no confiarlas cuando sí hay un proxy real hace que todos los usuarios reales compartan una sola IP a ojos de Express, saturando el límite entre sí.</w:t>
+      </w:r>
+    </w:p>
+    <w:p>
+      <w:r>
+        <w:rPr>
+          <w:b/>
+        </w:rPr>
+        <w:t>Corrección aplicada:</w:t>
+      </w:r>
+      <w:r>
+        <w:t xml:space="preserve"> El valor de TRUST_PROXY ahora se valida contra las formas que Express realmente acepta (boolean, número de saltos, palabra clave reservada, o IP/CIDR) antes de aplicarse; un valor inválido detiene el arranque del servidor con un mensaje claro, mismo criterio de fail-fast que ya se usa para SESSION_SECRET (hallazgo #6).</w:t>
+      </w:r>
+    </w:p>
+    <w:p>
+      <w:pPr>
         <w:pStyle w:val="Ttulo1"/>
         <w:spacing w:before="400" w:after="200"/>
       </w:pPr>
       <w:r>
-        <w:t>4. Evidencia Visual de Pruebas</w:t>
+        <w:t>4</w:t>
+      </w:r>
+      <w:r>
+        <w:t>. Evidencia Visual de Pruebas</w:t>
       </w:r>
     </w:p>
     <w:p>
@@ -5384,7 +6222,13 @@
         <w:spacing w:after="150"/>
       </w:pPr>
       <w:r>
-        <w:t>El proceso de revisión de seguridad, realizado en tres fases a lo largo del proyecto, permitió identificar y corregir 31 hallazgos distribuidos en los principales módulos funcionales del sistema, incluyendo 6 vulnerabilidades de severidad crítica relacionadas con control de acceso a contenido, escalada de privilegios, y una vulnerabilidad XSS almacenada, además de refuerzos posteriores en validación de archivos, cabeceras HTTP, límites de uso, dependencias de terceros, integridad transaccional y manejo consistente de archivos ante fallos a mitad de una operación. La mayoría de las correcciones fueron verificadas directamente contra el sistema en ejecución, comparando el comportamiento observado antes y después de cada cambio.</w:t>
+        <w:t xml:space="preserve">El proceso de revisión de seguridad, </w:t>
+      </w:r>
+      <w:r>
+        <w:t>realizado en cuatro fases a lo largo del proyecto, permitió identificar y corregir 36 hallazgos distribuidos</w:t>
+      </w:r>
+      <w:r>
+        <w:t xml:space="preserve"> en los principales módulos funcionales del sistema, incluyendo 6 vulnerabilidades de severidad crítica relacionadas con control de acceso a contenido, escalada de privilegios, y una vulnerabilidad XSS almacenada, además de refuerzos posteriores en validación de archivos, cabeceras HTTP, límites de uso, dependencias de terceros, integridad transaccional y manejo consistente de archivos ante fallos a mitad de una operación. La mayoría de las correcciones fueron verificadas directamente contra el sistema en ejecución, comparando el comportamiento observado antes y después de cada cambio.</w:t>
       </w:r>
     </w:p>
     <w:p>

</xml_diff>